<commit_message>
Count service before 27/11/2017 again; clear Accept flags; withdraw policy v1.1 draft
Co-Authored-By: Claude Fable 5.1 <noreply@anthropic.com>
Claude-Session: https://claude.ai/code/session_01EcDw2RdbzrHBowkHsXKDir
</commit_message>
<xml_diff>
--- a/Bonus Leave - flowchart v2.0 vs 2026 policy - email to Graham.docx
+++ b/Bonus Leave - flowchart v2.0 vs 2026 policy - email to Graham.docx
@@ -40,7 +40,7 @@
           <w:sz w:val="22"/>
           <w:szCs w:val="22"/>
         </w:rPr>
-        <w:t xml:space="preserve">Thanks for sending the CTS Additional Leave Bonus Scheme flowchart v2.0 (04/09/25). As we agreed in our meeting, the only change from the 2017 scheme is that Bonus Leave is no longer paid out on termination, and v2.0 confirms that: every other step is the same as v1.0. I have set the tracker up on v2.0, and nobody counts service before the scheme started on 27/11/2017, so everyone employed before that date is treated as commencing on 27/11/2017 and we do not count back.</w:t>
+        <w:t xml:space="preserve">Thanks for sending the CTS Additional Leave Bonus Scheme flowchart v2.0 (04/09/25). As we agreed in our meeting, the only change from the 2017 scheme is that Bonus Leave is no longer paid out on termination, and v2.0 confirms that: every other step is the same as v1.0. I have set the tracker up on v2.0. Service before the scheme started on 27/11/2017 counts towards the 3-year and 5-year milestones, but no day is earned for a milestone that fell before that date.</w:t>
       </w:r>
     </w:p>
     <w:p>
@@ -792,20 +792,20 @@
           <w:sz w:val="22"/>
           <w:szCs w:val="22"/>
         </w:rPr>
-        <w:t xml:space="preserve">Tracker: service counts from the full-time start date (or the Eligibility Letter date if different), or from 27/11/2017 for anyone employed before the scheme began. Nothing is counted back before the scheme start, so those staff reach 3 years on 27/11/2020 and 5 years on 27/11/2022.</w:t>
-      </w:r>
-    </w:p>
-    <w:p>
-      <w:pPr>
-        <w:spacing w:after="120"/>
-      </w:pPr>
-      <w:r>
-        <w:rPr>
-          <w:rFonts w:ascii="Arial" w:cs="Arial" w:eastAsia="Arial" w:hAnsi="Arial"/>
-          <w:sz w:val="22"/>
-          <w:szCs w:val="22"/>
-        </w:rPr>
-        <w:t xml:space="preserve">On this basis Daniel Sobkowski, Duncan Lugstein and Jordan Sexty were credited from their original anniversaries under the old tally and now hold more in EH than their entitlement: Daniel 40 hours, Duncan 160 hours and Jordan 64 hours over. I checked Daniel's and Jordan's personnel files and could not find an eligibility letter for either of them, yet HR accrued for them from 2017. I need your decision on whether that excess stands as granted or is reversed.</w:t>
+        <w:t xml:space="preserve">Tracker: service counts from the full-time start date (or the Eligibility Letter date if different), including service before 27/11/2017. Milestones that fell before the scheme start earn nothing; the first day is the first milestone on or after 27/11/2017.</w:t>
+      </w:r>
+    </w:p>
+    <w:p>
+      <w:pPr>
+        <w:spacing w:after="120"/>
+      </w:pPr>
+      <w:r>
+        <w:rPr>
+          <w:rFonts w:ascii="Arial" w:cs="Arial" w:eastAsia="Arial" w:hAnsi="Arial"/>
+          <w:sz w:val="22"/>
+          <w:szCs w:val="22"/>
+        </w:rPr>
+        <w:t xml:space="preserve">On this basis Jordan Sexty's EH balance matches the scheme exactly. Duncan Lugstein holds 16 hours more than the scheme gives because HR ran his accruals on a Feb/May/Aug/Nov cycle instead of his October anniversary. Daniel Sobkowski is 104 hours under: the scheme gives him 43 days from 27/11/2017 but EH only holds 30. I checked Daniel's and Jordan's personnel files and could not find an eligibility letter for either of them.</w:t>
       </w:r>
     </w:p>
     <w:p>
@@ -1068,7 +1068,7 @@
           <w:sz w:val="22"/>
           <w:szCs w:val="22"/>
         </w:rPr>
-        <w:t xml:space="preserve">Decisions I need from you: (1) confirm the flowchart v2.0 is the version we work to, or tell me the 2026 policy document overrides it (part-time eligibility and two days at 5 years), in which case I flip one switch in the tracker and Isaac and Tyrell come back on; (2) whether the excess hours for Daniel, Duncan and Jordan stand as granted or are reversed; (3) whether the 9 days for Isaac and 1 day for Tyrell on the HR tally are reversed. The eligibility letters I listed in my earlier email still stand, with Isaac and Tyrell removed from that list under the flowchart.</w:t>
+        <w:t xml:space="preserve">Decisions I need from you: (1) confirm the flowchart v2.0 is the version we work to, or tell me the 2026 policy document overrides it (part-time eligibility and two days at 5 years), in which case I flip one switch in the tracker and Isaac and Tyrell come back on; (2) whether the 16 hours Duncan is over stands, and whether I post the 104 hours owed to Daniel; (3) whether the 9 days for Isaac and 1 day for Tyrell on the HR tally are reversed. The eligibility letters I listed in my earlier email still stand, with Isaac and Tyrell removed from that list under the flowchart.</w:t>
       </w:r>
     </w:p>
     <w:p>

</xml_diff>

<commit_message>
Apply 2026 policy accrual rules (part-time eligible, 2 days at 5 years); notes and comparison email updated
Co-Authored-By: Claude Fable 5.1 <noreply@anthropic.com>
Claude-Session: https://claude.ai/code/session_01EcDw2RdbzrHBowkHsXKDir
</commit_message>
<xml_diff>
--- a/Bonus Leave - flowchart v2.0 vs 2026 policy - email to Graham.docx
+++ b/Bonus Leave - flowchart v2.0 vs 2026 policy - email to Graham.docx
@@ -40,7 +40,7 @@
           <w:sz w:val="22"/>
           <w:szCs w:val="22"/>
         </w:rPr>
-        <w:t xml:space="preserve">Thanks for sending the CTS Additional Leave Bonus Scheme flowchart v2.0 (04/09/25). As we agreed in our meeting, the only change from the 2017 scheme is that Bonus Leave is no longer paid out on termination, and v2.0 confirms that: every other step is the same as v1.0. I have set the tracker up on v2.0. Service before the scheme started on 27/11/2017 counts towards the 3-year and 5-year milestones, but no day is earned for a milestone that fell before that date.</w:t>
+        <w:t xml:space="preserve">Thanks for sending the CTS Additional Leave Bonus Scheme flowchart v2.0 (04/09/25). As we agreed in our meeting, the only change from the 2017 scheme is that Bonus Leave is no longer paid out on termination, and v2.0 confirms that: every other step is the same as v1.0. The tracker applies the written 2026 policy where it goes further than the flowchart, as set out below. Service before the scheme started on 27/11/2017 counts towards the 3-year and 5-year milestones, but no day is earned for a milestone that fell before that date.</w:t>
       </w:r>
     </w:p>
     <w:p>
@@ -290,7 +290,7 @@
           <w:sz w:val="22"/>
           <w:szCs w:val="22"/>
         </w:rPr>
-        <w:t xml:space="preserve">Tracker: full-time only, per the flowchart. Isaac Butterworth's part-time service from 17/09/2019 does not count; his full-time service runs from 19/01/2026 and his first day falls on 19/01/2029. Tyrell Shortt (part-time) is not eligible. The HR tally credited 9 days to Isaac and 1 day to Tyrell on a part-time basis, so those need reversing unless you decide the policy document applies.</w:t>
+        <w:t xml:space="preserve">Tracker: follows the 2026 policy. Isaac Butterworth's part-time service (38 hours) from 17/09/2019 counts, giving him 9 days, the same as the HR tally. Tyrell Shortt (part-time, 38 hours, from 31/08/2021) earned his first day on 31/08/2026.</w:t>
       </w:r>
     </w:p>
     <w:p>
@@ -466,7 +466,7 @@
           <w:sz w:val="22"/>
           <w:szCs w:val="22"/>
         </w:rPr>
-        <w:t xml:space="preserve">Tracker: one day on the 5-year anniversary, per the flowchart. This matches the HR tally.</w:t>
+        <w:t xml:space="preserve">Tracker: one day for a 5-year anniversary before 08/09/2026, two days from that date on. This matches the HR tally for everyone who has already passed 5 years.</w:t>
       </w:r>
     </w:p>
     <w:p>
@@ -555,7 +555,7 @@
           <w:sz w:val="22"/>
           <w:szCs w:val="22"/>
         </w:rPr>
-        <w:t xml:space="preserve">Tracker: not applied.</w:t>
+        <w:t xml:space="preserve">Tracker: applied for part-time staff on 24 hours or more. Tyrell is the first to reach it.</w:t>
       </w:r>
     </w:p>
     <w:p>
@@ -1068,7 +1068,7 @@
           <w:sz w:val="22"/>
           <w:szCs w:val="22"/>
         </w:rPr>
-        <w:t xml:space="preserve">Decisions I need from you: (1) confirm the flowchart v2.0 is the version we work to, or tell me the 2026 policy document overrides it (part-time eligibility and two days at 5 years), in which case I flip one switch in the tracker and Isaac and Tyrell come back on; (2) whether the 16 hours Duncan is over stands, and whether I post the 104 hours owed to Daniel; (3) whether the 9 days for Isaac and 1 day for Tyrell on the HR tally are reversed. The eligibility letters I listed in my earlier email still stand, with Isaac and Tyrell removed from that list under the flowchart.</w:t>
+        <w:t xml:space="preserve">Decisions I need from you: (1) confirm the 2026 policy document governs where it differs from the flowchart (part-time eligibility and two days at 5 years), which is how the tracker is set; (2) whether the 16 hours Duncan is over stands, and whether I post the 104 hours owed to Daniel. The eligibility letters I listed in my earlier email still stand.</w:t>
       </w:r>
     </w:p>
     <w:p>

</xml_diff>